<commit_message>
Carry the blue on the inserted runs so it survives Accept All
Word keeps the revision colour in the reader's settings, not the file, so
accepting a change returned the text to black. Each inserted run now also
carries an explicit character colour, #4A90D9, which lives in the document and
stays after acceptance -- what a journal's marked copy needs, and identical in
every viewer rather than depending on who opens it.

All 114 inserted text runs are coloured and no blue appears outside an
insertion, so rejecting a change still takes its colour with it. Reject All
continues to reproduce the submitted manuscript exactly.

To produce a clean black manuscript at the end: select all, font colour
Automatic.

Co-Authored-By: Claude Opus 5 <noreply@anthropic.com>
</commit_message>
<xml_diff>
--- a/Paper_RTR_consistency/HSeeker_revised_tracked.docx
+++ b/Paper_RTR_consistency/HSeeker_revised_tracked.docx
@@ -356,6 +356,7 @@
       <w:ins w:id="9002" w:author="HSeeker revision" w:date="2026-10-15T00:00:00Z">
         <w:r>
           <w:rPr>
+            <w:color w:val="4A90D9"/>
             <w:rtl w:val="0"/>
           </w:rPr>
           <w:t xml:space="preserve">a computational tool</w:t>
@@ -408,6 +409,7 @@
       <w:ins w:id="9231" w:author="HSeeker revision" w:date="2026-10-15T00:00:00Z">
         <w:r>
           <w:rPr>
+            <w:color w:val="4A90D9"/>
             <w:rtl w:val="0"/>
           </w:rPr>
           <w:t xml:space="preserve">identify and score putative H-DNA-forming sequences</w:t>
@@ -448,6 +450,7 @@
       <w:ins w:id="9004" w:author="HSeeker revision" w:date="2026-10-15T00:00:00Z">
         <w:r>
           <w:rPr>
+            <w:color w:val="4A90D9"/>
             <w:rtl w:val="0"/>
           </w:rPr>
           <w:t xml:space="preserve">Overlapping candidates are resolved by one of three user-selectable rules: retaining the longest and most compact motif within each overlapping region, retaining the highest-scoring motif, or reporting every candidate.</w:t>
@@ -494,6 +497,7 @@
       <w:ins w:id="9006" w:author="HSeeker revision" w:date="2026-10-15T00:00:00Z">
         <w:r>
           <w:rPr>
+            <w:color w:val="4A90D9"/>
             <w:rtl w:val="0"/>
           </w:rPr>
           <w:t xml:space="preserve">Finally, an experimentally informed stability scoring model evaluates the candidate motifs using Hoogsteen G-G and A-A bonds, consecutive-pair stacking, and penalties for mismatches and disrupted stacks; the resulting score ranks candidates relative to one another within this scheme and is not a calibrated free energy.</w:t>
@@ -522,6 +526,7 @@
       <w:ins w:id="9008" w:author="HSeeker revision" w:date="2026-10-15T00:00:00Z">
         <w:r>
           <w:rPr>
+            <w:color w:val="4A90D9"/>
             <w:rtl w:val="0"/>
           </w:rPr>
           <w:t xml:space="preserve">On a balanced benchmark of 130 experimentally characterised and designed sequences, HSeeker detected 63 of 65 H-DNA-forming sequences and rejected all 65 non-forming sequences, and its genome-wide predictions were enriched for mirror repeats found single-stranded in cells by permanganate/S1 footprinting. HSeeker is also user-friendly,</w:t>
@@ -646,6 +651,7 @@
       <w:ins w:id="9010" w:author="HSeeker revision" w:date="2026-10-15T00:00:00Z">
         <w:r>
           <w:rPr>
+            <w:color w:val="4A90D9"/>
             <w:rtl w:val="0"/>
           </w:rPr>
           <w:t xml:space="preserve">stability scoring</w:t>
@@ -704,6 +710,7 @@
       <w:ins w:id="9012" w:author="HSeeker revision" w:date="2026-10-15T00:00:00Z">
         <w:r>
           <w:rPr>
+            <w:color w:val="4A90D9"/>
             <w:rtl w:val="0"/>
           </w:rPr>
           <w:t xml:space="preserve">a center-outward mirror-repeat search, three selectable overlap-resolution rules, and an experimentally informed stability-scoring model</w:t>
@@ -756,6 +763,7 @@
       <w:ins w:id="9014" w:author="HSeeker revision" w:date="2026-10-15T00:00:00Z">
         <w:r>
           <w:rPr>
+            <w:color w:val="4A90D9"/>
             <w:rtl w:val="0"/>
           </w:rPr>
           <w:t xml:space="preserve">On a balanced benchmark of 130 experimentally characterised and designed sequences, HSeeker achieved higher accuracy than four existing tools, matching triplex on experimentally characterised sequences while rejecting the mirror-disrupted controls that triplex accepted.</w:t>
@@ -808,6 +816,7 @@
       <w:ins w:id="9016" w:author="HSeeker revision" w:date="2026-10-15T00:00:00Z">
         <w:r>
           <w:rPr>
+            <w:color w:val="4A90D9"/>
             <w:rtl w:val="0"/>
           </w:rPr>
           <w:t xml:space="preserve">analysing human chromosome 1 in 16 s and the complete human genome in 3.4 min on 16 cores</w:t>
@@ -1341,6 +1350,7 @@
       <w:ins w:id="9018" w:author="HSeeker revision" w:date="2026-10-15T00:00:00Z">
         <w:r>
           <w:rPr>
+            <w:color w:val="4A90D9"/>
             <w:rtl w:val="0"/>
           </w:rPr>
           <w:t xml:space="preserve">but its mirror-repeat module tolerates no mismatch in mirror symmetry, and the subset it labels as triplex-forming is selected by a purine/pyrimidine count on the reported strand rather than by a purity threshold, so mirror repeats written on the pyrimidine-rich strand are not labelled as triplex-forming</w:t>
@@ -1381,7 +1391,7 @@
       <w:ins w:id="9020" w:author="HSeeker revision" w:date="2026-10-15T00:00:00Z">
         <w:r>
           <w:rPr>
-            <w:color w:val="1f1f1f"/>
+            <w:color w:val="4A90D9"/>
             <w:rtl w:val="0"/>
           </w:rPr>
           <w:t xml:space="preserve">NeSSie is a C/C++ library and tool for the detection of approximate sequence symmetries, including mirror symmetry and triplex-forming potential, utilizing an optimal global alignment based on the Needleman-Wunsch algorithm</w:t>
@@ -1415,7 +1425,7 @@
       <w:ins w:id="9022" w:author="HSeeker revision" w:date="2026-10-15T00:00:00Z">
         <w:r>
           <w:rPr>
-            <w:color w:val="1f1f1f"/>
+            <w:color w:val="4A90D9"/>
             <w:rtl w:val="0"/>
           </w:rPr>
           <w:t xml:space="preserve">and allowing gaps, mismatches, or asymmetric loops to be present. Its search returns symmetric or purine-rich k-mers rather than arm-spacer-arm motifs, so a mirror repeat whose two arms flank a non-symmetric spacer is not returned as a single motif.</w:t>
@@ -1608,6 +1618,7 @@
       <w:ins w:id="9233" w:author="HSeeker revision" w:date="2026-10-15T00:00:00Z">
         <w:r>
           <w:rPr>
+            <w:color w:val="4A90D9"/>
             <w:rtl w:val="0"/>
           </w:rPr>
           <w:t xml:space="preserve">scalable annotation of putative H-DNA-forming loci</w:t>
@@ -1964,6 +1975,7 @@
       <w:ins w:id="9024" w:author="HSeeker revision" w:date="2026-10-15T00:00:00Z">
         <w:r>
           <w:rPr>
+            <w:color w:val="4A90D9"/>
             <w:rtl w:val="0"/>
           </w:rPr>
           <w:t xml:space="preserve">eliminates center-spacer pairs whose right arm cannot satisfy the composition constraint. After enumeration, matching base pairs at the inner ends of the spacer are absorbed into the arms where the purity criterion permits, so that a motif is reported with its maximal arm representation, and candidates arising from different centre and spacer combinations that normalise to the same arm and spacer partition are reported once.</w:t>
@@ -2639,6 +2651,7 @@
       <w:ins w:id="9042" w:author="HSeeker revision" w:date="2026-10-15T00:00:00Z">
         <w:r>
           <w:rPr>
+            <w:color w:val="4A90D9"/>
             <w:rtl w:val="0"/>
           </w:rPr>
           <w:t xml:space="preserve">as described in Algorithm 2</w:t>
@@ -2669,6 +2682,7 @@
       <w:ins w:id="9044" w:author="HSeeker revision" w:date="2026-10-15T00:00:00Z">
         <w:r>
           <w:rPr>
+            <w:color w:val="4A90D9"/>
             <w:rtl w:val="0"/>
           </w:rPr>
           <w:t xml:space="preserve">The overlap-removal step is described in Algorithm 3</w:t>
@@ -2754,6 +2768,7 @@
       <w:ins w:id="9026" w:author="HSeeker revision" w:date="2026-10-15T00:00:00Z">
         <w:r>
           <w:rPr>
+            <w:color w:val="4A90D9"/>
             <w:rtl w:val="0"/>
           </w:rPr>
           <w:t xml:space="preserve">as these do not form stable inter-strand triplex interactions despite satisfying homopurine/homopyrimidine requirements. Both rules are fixed and are not fitted during evaluation. They were, however, chosen with knowledge of the H-DNA literature and of the composition of our benchmark, and the benchmark is therefore not an independent test of them: because the single-base homopolymers are reported separately, neither filter changes any benchmark call, so the reported metrics neither depend on the filters nor support them. Evidence bearing on the filters is drawn instead from published single-stranded DNA maps and is presented in the Results.</w:t>
@@ -2940,6 +2955,7 @@
       <w:ins w:id="9028" w:author="HSeeker revision" w:date="2026-10-15T00:00:00Z">
         <w:r>
           <w:rPr>
+            <w:color w:val="4A90D9"/>
             <w:rtl w:val="0"/>
           </w:rPr>
           <w:t xml:space="preserve">The combination of these terms is a ranking score, not a free energy: the inputs are drawn from reported interaction energies, but the total has no validated physical units and we do not report it in kcal/mol. Taken together, the HSeeker stability scoring was calculated as follows:</w:t>
@@ -3108,6 +3124,7 @@
       <w:ins w:id="9030" w:author="HSeeker revision" w:date="2026-10-15T00:00:00Z">
         <w:r>
           <w:rPr>
+            <w:color w:val="4A90D9"/>
             <w:rtl w:val="0"/>
           </w:rPr>
           <w:t xml:space="preserve">However, H-DNA is thermodynamically unfavourable with very long spacer lengths; thus, we require that the spacer formed by folding the trimmed arm tails inward does not exceed the length of the selected arm window.</w:t>
@@ -3247,6 +3264,7 @@
       <w:ins w:id="9032" w:author="HSeeker revision" w:date="2026-10-15T00:00:00Z">
         <w:r>
           <w:rPr>
+            <w:color w:val="4A90D9"/>
             <w:rtl w:val="0"/>
           </w:rPr>
           <w:t xml:space="preserve">we consider the values in Supplementary Table 2</w:t>
@@ -4725,6 +4743,7 @@
       <w:ins w:id="9034" w:author="HSeeker revision" w:date="2026-10-15T00:00:00Z">
         <w:r>
           <w:rPr>
+            <w:color w:val="4A90D9"/>
             <w:rtl w:val="0"/>
           </w:rPr>
           <w:t xml:space="preserve">The procedure yields a stacking score, a pairing score, their sum as the total score, clamped at zero so that the reported score is non-negative,</w:t>
@@ -4804,6 +4823,7 @@
       <w:ins w:id="9046" w:author="HSeeker revision" w:date="2026-10-15T00:00:00Z">
         <w:r>
           <w:rPr>
+            <w:color w:val="4A90D9"/>
             <w:rtl w:val="0"/>
           </w:rPr>
           <w:t xml:space="preserve">The scoring procedure is described in Algorithm 4.</w:t>
@@ -4833,6 +4853,7 @@
       <w:ins w:id="9038" w:author="HSeeker revision" w:date="2026-10-15T00:00:00Z">
         <w:r>
           <w:rPr>
+            <w:color w:val="4A90D9"/>
             <w:b w:val="1"/>
             <w:bCs w:val="1"/>
             <w:rtl w:val="0"/>
@@ -4852,6 +4873,7 @@
       <w:ins w:id="9036" w:author="HSeeker revision" w:date="2026-10-15T00:00:00Z">
         <w:r>
           <w:rPr>
+            <w:color w:val="4A90D9"/>
             <w:b w:val="1"/>
             <w:bCs w:val="1"/>
             <w:rtl w:val="0"/>
@@ -4899,6 +4921,7 @@
       <w:ins w:id="9040" w:author="HSeeker revision" w:date="2026-10-15T00:00:00Z">
         <w:r>
           <w:rPr>
+            <w:color w:val="4A90D9"/>
             <w:b w:val="1"/>
             <w:bCs w:val="1"/>
             <w:rtl w:val="0"/>
@@ -4941,6 +4964,7 @@
       <w:ins w:id="9048" w:author="HSeeker revision" w:date="2026-10-15T00:00:00Z">
         <w:r>
           <w:rPr>
+            <w:color w:val="4A90D9"/>
             <w:rtl w:val="0"/>
           </w:rPr>
           <w:t xml:space="preserve">We benchmarked HSeeker against four existing tools, triplex, Triplexator, NeSSie and nBMST, running all five independently on the 130 benchmark sequences.</w:t>
@@ -4965,6 +4989,7 @@
       <w:ins w:id="9050" w:author="HSeeker revision" w:date="2026-10-15T00:00:00Z">
         <w:r>
           <w:rPr>
+            <w:color w:val="4A90D9"/>
             <w:i w:val="1"/>
             <w:iCs w:val="1"/>
             <w:rtl w:val="0"/>
@@ -5113,6 +5138,7 @@
       <w:ins w:id="9054" w:author="HSeeker revision" w:date="2026-10-15T00:00:00Z">
         <w:r>
           <w:rPr>
+            <w:color w:val="4A90D9"/>
             <w:i w:val="1"/>
             <w:iCs w:val="1"/>
             <w:rtl w:val="0"/>
@@ -5151,6 +5177,7 @@
       <w:ins w:id="9056" w:author="HSeeker revision" w:date="2026-10-15T00:00:00Z">
         <w:r>
           <w:rPr>
+            <w:color w:val="4A90D9"/>
             <w:rtl w:val="0"/>
           </w:rPr>
           <w:t xml:space="preserve">randomly inserted each of the 130 sequences into it</w:t>
@@ -5173,6 +5200,7 @@
       <w:ins w:id="9058" w:author="HSeeker revision" w:date="2026-10-15T00:00:00Z">
         <w:r>
           <w:rPr>
+            <w:color w:val="4A90D9"/>
             <w:rtl w:val="0"/>
           </w:rPr>
           <w:t xml:space="preserve">a threshold chosen to accommodate cases where tools extend hits into flanking sequence or detect only the triplex core within a longer insertion. The criterion is varied from 0.50 to 0.95 as a sensitivity analysis, and the unmodified genome was scanned under the same settings to establish the background locus rate. This experiment measures recovery and the stability of a call across sequence context; it does not test whether H-DNA forms, and we draw no biological conclusion from it.</w:t>
@@ -5196,6 +5224,7 @@
       <w:ins w:id="9060" w:author="HSeeker revision" w:date="2026-10-15T00:00:00Z">
         <w:r>
           <w:rPr>
+            <w:color w:val="4A90D9"/>
             <w:rtl w:val="0"/>
           </w:rPr>
           <w:t xml:space="preserve">For both the direct and genomic-context analyses, performance was evaluated using the Matthews correlation coefficient, reported with percentile bootstrap intervals computed over records and over whole sequence families, together with sensitivity, specificity and predictive values reported with Wilson intervals.</w:t>
@@ -5217,6 +5246,9 @@
       </w:pPr>
       <w:ins w:id="9108" w:author="HSeeker revision" w:date="2026-10-15T00:00:00Z">
         <w:r>
+          <w:rPr>
+            <w:color w:val="4A90D9"/>
+          </w:rPr>
           <w:drawing>
             <wp:inline distB="114300" distT="114300" distL="114300" distR="114300">
               <wp:extent cx="6164681" cy="5291076"/>
@@ -5263,6 +5295,7 @@
       <w:ins w:id="9106" w:author="HSeeker revision" w:date="2026-10-15T00:00:00Z">
         <w:r>
           <w:rPr>
+            <w:color w:val="4A90D9"/>
             <w:b w:val="1"/>
             <w:bCs w:val="1"/>
             <w:rtl w:val="0"/>
@@ -5282,6 +5315,7 @@
       <w:ins w:id="9066" w:author="HSeeker revision" w:date="2026-10-15T00:00:00Z">
         <w:r>
           <w:rPr>
+            <w:color w:val="4A90D9"/>
             <w:b w:val="1"/>
             <w:bCs w:val="1"/>
             <w:rtl w:val="0"/>
@@ -5301,6 +5335,7 @@
       <w:ins w:id="9064" w:author="HSeeker revision" w:date="2026-10-15T00:00:00Z">
         <w:r>
           <w:rPr>
+            <w:color w:val="4A90D9"/>
             <w:b w:val="1"/>
             <w:bCs w:val="1"/>
             <w:rtl w:val="0"/>
@@ -5320,6 +5355,7 @@
       <w:ins w:id="9062" w:author="HSeeker revision" w:date="2026-10-15T00:00:00Z">
         <w:r>
           <w:rPr>
+            <w:color w:val="4A90D9"/>
             <w:b w:val="1"/>
             <w:bCs w:val="1"/>
             <w:rtl w:val="0"/>
@@ -5400,6 +5436,7 @@
       <w:ins w:id="9110" w:author="HSeeker revision" w:date="2026-10-15T00:00:00Z">
         <w:r>
           <w:rPr>
+            <w:color w:val="4A90D9"/>
             <w:b w:val="1"/>
             <w:bCs w:val="1"/>
             <w:rtl w:val="0"/>
@@ -5480,6 +5517,7 @@
       <w:ins w:id="9112" w:author="HSeeker revision" w:date="2026-10-15T00:00:00Z">
         <w:r>
           <w:rPr>
+            <w:color w:val="4A90D9"/>
             <w:b w:val="1"/>
             <w:bCs w:val="1"/>
             <w:rtl w:val="0"/>
@@ -7070,6 +7108,7 @@
       <w:ins w:id="9114" w:author="HSeeker revision" w:date="2026-10-15T00:00:00Z">
         <w:r>
           <w:rPr>
+            <w:color w:val="4A90D9"/>
             <w:b w:val="1"/>
             <w:bCs w:val="1"/>
             <w:rtl w:val="0"/>
@@ -7206,6 +7245,7 @@
       <w:ins w:id="9070" w:author="HSeeker revision" w:date="2026-10-15T00:00:00Z">
         <w:r>
           <w:rPr>
+            <w:color w:val="4A90D9"/>
             <w:rtl w:val="0"/>
           </w:rPr>
           <w:t xml:space="preserve">with all other parameters held at their defaults (minimum arm length 8 bp, maximum spacer 10 bp, purity threshold 0.90, mismatch tolerance 0.10, AT-content threshold 0.80 with homopolymer exclusion, RMQ purity prefilter enabled, scoring enabled).</w:t>
@@ -7242,6 +7282,7 @@
       <w:ins w:id="9068" w:author="HSeeker revision" w:date="2026-10-15T00:00:00Z">
         <w:r>
           <w:rPr>
+            <w:color w:val="4A90D9"/>
             <w:rtl w:val="0"/>
           </w:rPr>
           <w:t xml:space="preserve">All runs produced an identical set of 45,927 non-overlapping putative H-DNA loci, confirming deterministic output across all parallelisation levels. At a single worker, the full pipeline was completed in 173.8 s (approximately 2.9 min). Increasing the thread count to 2, 4, 8, and 16 yielded wall-clock times of 89.6 s, 47.4 s, 26.7 s, and 16.3 s, corresponding to speedups of 1.94-fold, 3.67-fold, 6.51-fold, and 10.65-fold (Figure 2). Parallel efficiency remained above 90% through 4 workers and was 81% at 8 workers and 67% at 16 workers,</w:t>
@@ -7297,6 +7338,7 @@
       <w:ins w:id="9072" w:author="HSeeker revision" w:date="2026-10-15T00:00:00Z">
         <w:r>
           <w:rPr>
+            <w:color w:val="4A90D9"/>
             <w:rtl w:val="0"/>
           </w:rPr>
           <w:t xml:space="preserve">For comparison we timed four existing tools on the same chromosome, the same node and the same day. Triplexator, which provides native multi-threading, completed in 45.0 s at 16 threads and reported 275,476 duplex target sites. The triplex package is single-threaded; split into 1 Mbp windows and run as 16 parallel processes it completed in 64.7 s and reported 81,906 hits. nBMST and NeSSie provide no parallel mode and completed in 96.5 s and 295.7 s on one core, reporting 147,222 mirror repeats, of which 33,519 were classified as triplex-forming, and 720,811 motif occurrences respectively. Peak memory was 1,714 MB for Triplexator, 660 MB for each triplex worker process, 866 MB for nBMST and 1,056 MB for NeSSie, against 1,334 MB for HSeeker. The hit counts reported by triplex and Triplexator reproduce our earlier measurements exactly. The comparison should be read with the differences in target class in mind: Triplexator enumerates duplex target sites for a separately supplied third strand and NeSSie enumerates symmetric k-mers, neither of which is the same object as an intramolecular mirror repeat, and the loci counts are correspondingly not comparable.</w:t>
@@ -7332,6 +7374,7 @@
       <w:ins w:id="9074" w:author="HSeeker revision" w:date="2026-10-15T00:00:00Z">
         <w:r>
           <w:rPr>
+            <w:color w:val="4A90D9"/>
             <w:rtl w:val="0"/>
           </w:rPr>
           <w:t xml:space="preserve">Rather than extrapolating from chromosome 1, we ran the complete hg38 primary assembly. At 16 workers it completed in 204.5 s, that is 3.4 min, with a peak memory of 2,296 MB, reporting 559,601 non-overlapping H-DNA loci; three independent runs produced identical output. Score-based overlap selection, which defers overlap resolution until after scoring, took 23.9 s on chromosome 1 and reported 47,217 loci.</w:t>
@@ -7477,6 +7520,7 @@
       <w:ins w:id="9116" w:author="HSeeker revision" w:date="2026-10-15T00:00:00Z">
         <w:r>
           <w:rPr>
+            <w:color w:val="4A90D9"/>
             <w:b w:val="1"/>
             <w:bCs w:val="1"/>
             <w:rtl w:val="0"/>
@@ -7524,6 +7568,7 @@
       <w:ins w:id="9076" w:author="HSeeker revision" w:date="2026-10-15T00:00:00Z">
         <w:r>
           <w:rPr>
+            <w:color w:val="4A90D9"/>
             <w:b w:val="1"/>
             <w:bCs w:val="1"/>
             <w:rtl w:val="0"/>
@@ -7783,6 +7828,7 @@
       <w:ins w:id="9078" w:author="HSeeker revision" w:date="2026-10-15T00:00:00Z">
         <w:r>
           <w:rPr>
+            <w:color w:val="4A90D9"/>
             <w:rtl w:val="0"/>
           </w:rPr>
           <w:t xml:space="preserve">HSeeker detected 63 of the 65 H-DNA-forming sequences and rejected all 65 non-forming sequences, corresponding to a sensitivity of 0.969 (95% CI 0.895-0.992), a specificity of 1.000 (0.944-1.000) and a Matthews correlation coefficient of 0.970 (0.925-1.000) (Table 1). The two sequences that were not detected, the c-MYC nuclease-sensitive element construct (ACCCTCCCC)4 and the gamma-globin -228/-189 element, are tandem direct repeats rather than mirror repeats and therefore fall outside the structural model that HSeeker implements. Restricting the evaluation to the 70 experimental records gives a sensitivity of 0.969 (0.895-0.992) and a specificity of 1.000 (0.566-1.000); the width of the latter interval reflects the five experimental non-forming constructs that survived curation, and conclusions about specificity rest largely on the designed negatives. We also asked whether the stability score could improve classification beyond detection. Within each training fold we selected the score threshold maximising Youden's J statistic and applied it only to the held-out records. Out of fold this produced a coefficient of 0.949 (0.937-0.961) under repeated five-fold cross-validation and 0.955 (0.898-1.000) under leave-one-family-out and leave-one-study-out validation, below the 0.970 obtained with no threshold. The threshold removed no false positive, because no non-forming record retains a candidate once the purity requirement is applied, and it discarded forming records whose scores fell below a threshold learned without them. For the same reason the area under the ROC curve on this benchmark, 0.985, restates the detection result rather than adding to it. We therefore report no score threshold: a sequence is called H-DNA-forming when it contains a candidate satisfying the detection criteria, and the stability score is used to rank candidates.</w:t>
@@ -7855,6 +7901,7 @@
       <w:ins w:id="9080" w:author="HSeeker revision" w:date="2026-10-15T00:00:00Z">
         <w:r>
           <w:rPr>
+            <w:color w:val="4A90D9"/>
             <w:rtl w:val="0"/>
           </w:rPr>
           <w:t xml:space="preserve">The errors are informative. Mirror-repeat detection alone, before the purity requirement is applied, calls seven of the 65 non-forming sequences: the experimentally non-forming c-MYC control B-33, one G-quadruplex-forming sequence, two Z-DNA-forming (CG)n repeats and all three perfect mirror repeats of balanced composition. The purity requirement removes all seven without losing a forming sequence, which is the clearest demonstration in the benchmark that mirror symmetry alone is not sufficient and that the composition criterion is doing the discriminating work. No designed negative of any class is called at the default settings.</w:t>
@@ -7875,6 +7922,9 @@
       </w:pPr>
       <w:ins w:id="9229" w:author="HSeeker revision" w:date="2026-10-15T00:00:00Z">
         <w:r>
+          <w:rPr>
+            <w:color w:val="4A90D9"/>
+          </w:rPr>
           <w:t xml:space="preserve">Table 1: Detection performance on the revised benchmark. Values are point estimates with 95% confidence intervals: Wilson intervals for proportions and percentile bootstrap intervals for the Matthews correlation coefficient. The balanced benchmark combines 70 experimental records with 60 designed negatives. Construct-level records are those for which the published experiment tested the exact sequence in the benchmark.</w:t>
         </w:r>
       </w:ins>
@@ -7909,6 +7959,7 @@
             <w:ins w:id="9137" w:author="HSeeker revision" w:date="2026-10-15T00:00:00Z">
               <w:r>
                 <w:rPr>
+                  <w:color w:val="4A90D9"/>
                   <w:b/>
                 </w:rPr>
                 <w:t xml:space="preserve">Evaluation set</w:t>
@@ -7929,6 +7980,7 @@
             <w:ins w:id="9139" w:author="HSeeker revision" w:date="2026-10-15T00:00:00Z">
               <w:r>
                 <w:rPr>
+                  <w:color w:val="4A90D9"/>
                   <w:b/>
                 </w:rPr>
                 <w:t xml:space="preserve">n</w:t>
@@ -7949,6 +8001,7 @@
             <w:ins w:id="9141" w:author="HSeeker revision" w:date="2026-10-15T00:00:00Z">
               <w:r>
                 <w:rPr>
+                  <w:color w:val="4A90D9"/>
                   <w:b/>
                 </w:rPr>
                 <w:t xml:space="preserve">TP</w:t>
@@ -7969,6 +8022,7 @@
             <w:ins w:id="9143" w:author="HSeeker revision" w:date="2026-10-15T00:00:00Z">
               <w:r>
                 <w:rPr>
+                  <w:color w:val="4A90D9"/>
                   <w:b/>
                 </w:rPr>
                 <w:t xml:space="preserve">FN</w:t>
@@ -7989,6 +8043,7 @@
             <w:ins w:id="9145" w:author="HSeeker revision" w:date="2026-10-15T00:00:00Z">
               <w:r>
                 <w:rPr>
+                  <w:color w:val="4A90D9"/>
                   <w:b/>
                 </w:rPr>
                 <w:t xml:space="preserve">TN</w:t>
@@ -8009,6 +8064,7 @@
             <w:ins w:id="9147" w:author="HSeeker revision" w:date="2026-10-15T00:00:00Z">
               <w:r>
                 <w:rPr>
+                  <w:color w:val="4A90D9"/>
                   <w:b/>
                 </w:rPr>
                 <w:t xml:space="preserve">FP</w:t>
@@ -8029,6 +8085,7 @@
             <w:ins w:id="9149" w:author="HSeeker revision" w:date="2026-10-15T00:00:00Z">
               <w:r>
                 <w:rPr>
+                  <w:color w:val="4A90D9"/>
                   <w:b/>
                 </w:rPr>
                 <w:t xml:space="preserve">Sensitivity</w:t>
@@ -8049,6 +8106,7 @@
             <w:ins w:id="9151" w:author="HSeeker revision" w:date="2026-10-15T00:00:00Z">
               <w:r>
                 <w:rPr>
+                  <w:color w:val="4A90D9"/>
                   <w:b/>
                 </w:rPr>
                 <w:t xml:space="preserve">Specificity</w:t>
@@ -8069,6 +8127,7 @@
             <w:ins w:id="9153" w:author="HSeeker revision" w:date="2026-10-15T00:00:00Z">
               <w:r>
                 <w:rPr>
+                  <w:color w:val="4A90D9"/>
                   <w:b/>
                 </w:rPr>
                 <w:t xml:space="preserve">PPV</w:t>
@@ -8089,6 +8148,7 @@
             <w:ins w:id="9155" w:author="HSeeker revision" w:date="2026-10-15T00:00:00Z">
               <w:r>
                 <w:rPr>
+                  <w:color w:val="4A90D9"/>
                   <w:b/>
                 </w:rPr>
                 <w:t xml:space="preserve">NPV</w:t>
@@ -8109,6 +8169,7 @@
             <w:ins w:id="9157" w:author="HSeeker revision" w:date="2026-10-15T00:00:00Z">
               <w:r>
                 <w:rPr>
+                  <w:color w:val="4A90D9"/>
                   <w:b/>
                 </w:rPr>
                 <w:t xml:space="preserve">MCC</w:t>
@@ -8133,6 +8194,9 @@
             </w:pPr>
             <w:ins w:id="9160" w:author="HSeeker revision" w:date="2026-10-15T00:00:00Z">
               <w:r>
+                <w:rPr>
+                  <w:color w:val="4A90D9"/>
+                </w:rPr>
                 <w:t xml:space="preserve">Balanced benchmark</w:t>
               </w:r>
             </w:ins>
@@ -8150,6 +8214,9 @@
             </w:pPr>
             <w:ins w:id="9162" w:author="HSeeker revision" w:date="2026-10-15T00:00:00Z">
               <w:r>
+                <w:rPr>
+                  <w:color w:val="4A90D9"/>
+                </w:rPr>
                 <w:t xml:space="preserve">130</w:t>
               </w:r>
             </w:ins>
@@ -8167,6 +8234,9 @@
             </w:pPr>
             <w:ins w:id="9164" w:author="HSeeker revision" w:date="2026-10-15T00:00:00Z">
               <w:r>
+                <w:rPr>
+                  <w:color w:val="4A90D9"/>
+                </w:rPr>
                 <w:t xml:space="preserve">63</w:t>
               </w:r>
             </w:ins>
@@ -8184,6 +8254,9 @@
             </w:pPr>
             <w:ins w:id="9166" w:author="HSeeker revision" w:date="2026-10-15T00:00:00Z">
               <w:r>
+                <w:rPr>
+                  <w:color w:val="4A90D9"/>
+                </w:rPr>
                 <w:t xml:space="preserve">2</w:t>
               </w:r>
             </w:ins>
@@ -8201,6 +8274,9 @@
             </w:pPr>
             <w:ins w:id="9168" w:author="HSeeker revision" w:date="2026-10-15T00:00:00Z">
               <w:r>
+                <w:rPr>
+                  <w:color w:val="4A90D9"/>
+                </w:rPr>
                 <w:t xml:space="preserve">65</w:t>
               </w:r>
             </w:ins>
@@ -8218,6 +8294,9 @@
             </w:pPr>
             <w:ins w:id="9170" w:author="HSeeker revision" w:date="2026-10-15T00:00:00Z">
               <w:r>
+                <w:rPr>
+                  <w:color w:val="4A90D9"/>
+                </w:rPr>
                 <w:t xml:space="preserve">0</w:t>
               </w:r>
             </w:ins>
@@ -8235,6 +8314,9 @@
             </w:pPr>
             <w:ins w:id="9172" w:author="HSeeker revision" w:date="2026-10-15T00:00:00Z">
               <w:r>
+                <w:rPr>
+                  <w:color w:val="4A90D9"/>
+                </w:rPr>
                 <w:t xml:space="preserve">0.969 (0.895-0.992)</w:t>
               </w:r>
             </w:ins>
@@ -8252,6 +8334,9 @@
             </w:pPr>
             <w:ins w:id="9174" w:author="HSeeker revision" w:date="2026-10-15T00:00:00Z">
               <w:r>
+                <w:rPr>
+                  <w:color w:val="4A90D9"/>
+                </w:rPr>
                 <w:t xml:space="preserve">1.000 (0.944-1.000)</w:t>
               </w:r>
             </w:ins>
@@ -8269,6 +8354,9 @@
             </w:pPr>
             <w:ins w:id="9176" w:author="HSeeker revision" w:date="2026-10-15T00:00:00Z">
               <w:r>
+                <w:rPr>
+                  <w:color w:val="4A90D9"/>
+                </w:rPr>
                 <w:t xml:space="preserve">1.000 (0.943-1.000)</w:t>
               </w:r>
             </w:ins>
@@ -8286,6 +8374,9 @@
             </w:pPr>
             <w:ins w:id="9178" w:author="HSeeker revision" w:date="2026-10-15T00:00:00Z">
               <w:r>
+                <w:rPr>
+                  <w:color w:val="4A90D9"/>
+                </w:rPr>
                 <w:t xml:space="preserve">0.970 (0.898-0.992)</w:t>
               </w:r>
             </w:ins>
@@ -8303,6 +8394,9 @@
             </w:pPr>
             <w:ins w:id="9180" w:author="HSeeker revision" w:date="2026-10-15T00:00:00Z">
               <w:r>
+                <w:rPr>
+                  <w:color w:val="4A90D9"/>
+                </w:rPr>
                 <w:t xml:space="preserve">0.970 (0.925-1.000)</w:t>
               </w:r>
             </w:ins>
@@ -8325,6 +8419,9 @@
             </w:pPr>
             <w:ins w:id="9183" w:author="HSeeker revision" w:date="2026-10-15T00:00:00Z">
               <w:r>
+                <w:rPr>
+                  <w:color w:val="4A90D9"/>
+                </w:rPr>
                 <w:t xml:space="preserve">Experimental records</w:t>
               </w:r>
             </w:ins>
@@ -8342,6 +8439,9 @@
             </w:pPr>
             <w:ins w:id="9185" w:author="HSeeker revision" w:date="2026-10-15T00:00:00Z">
               <w:r>
+                <w:rPr>
+                  <w:color w:val="4A90D9"/>
+                </w:rPr>
                 <w:t xml:space="preserve">70</w:t>
               </w:r>
             </w:ins>
@@ -8359,6 +8459,9 @@
             </w:pPr>
             <w:ins w:id="9187" w:author="HSeeker revision" w:date="2026-10-15T00:00:00Z">
               <w:r>
+                <w:rPr>
+                  <w:color w:val="4A90D9"/>
+                </w:rPr>
                 <w:t xml:space="preserve">63</w:t>
               </w:r>
             </w:ins>
@@ -8376,6 +8479,9 @@
             </w:pPr>
             <w:ins w:id="9189" w:author="HSeeker revision" w:date="2026-10-15T00:00:00Z">
               <w:r>
+                <w:rPr>
+                  <w:color w:val="4A90D9"/>
+                </w:rPr>
                 <w:t xml:space="preserve">2</w:t>
               </w:r>
             </w:ins>
@@ -8393,6 +8499,9 @@
             </w:pPr>
             <w:ins w:id="9191" w:author="HSeeker revision" w:date="2026-10-15T00:00:00Z">
               <w:r>
+                <w:rPr>
+                  <w:color w:val="4A90D9"/>
+                </w:rPr>
                 <w:t xml:space="preserve">5</w:t>
               </w:r>
             </w:ins>
@@ -8410,6 +8519,9 @@
             </w:pPr>
             <w:ins w:id="9193" w:author="HSeeker revision" w:date="2026-10-15T00:00:00Z">
               <w:r>
+                <w:rPr>
+                  <w:color w:val="4A90D9"/>
+                </w:rPr>
                 <w:t xml:space="preserve">0</w:t>
               </w:r>
             </w:ins>
@@ -8427,6 +8539,9 @@
             </w:pPr>
             <w:ins w:id="9195" w:author="HSeeker revision" w:date="2026-10-15T00:00:00Z">
               <w:r>
+                <w:rPr>
+                  <w:color w:val="4A90D9"/>
+                </w:rPr>
                 <w:t xml:space="preserve">0.969 (0.895-0.992)</w:t>
               </w:r>
             </w:ins>
@@ -8444,6 +8559,9 @@
             </w:pPr>
             <w:ins w:id="9197" w:author="HSeeker revision" w:date="2026-10-15T00:00:00Z">
               <w:r>
+                <w:rPr>
+                  <w:color w:val="4A90D9"/>
+                </w:rPr>
                 <w:t xml:space="preserve">1.000 (0.566-1.000)</w:t>
               </w:r>
             </w:ins>
@@ -8461,6 +8579,9 @@
             </w:pPr>
             <w:ins w:id="9199" w:author="HSeeker revision" w:date="2026-10-15T00:00:00Z">
               <w:r>
+                <w:rPr>
+                  <w:color w:val="4A90D9"/>
+                </w:rPr>
                 <w:t xml:space="preserve">1.000 (0.943-1.000)</w:t>
               </w:r>
             </w:ins>
@@ -8478,6 +8599,9 @@
             </w:pPr>
             <w:ins w:id="9201" w:author="HSeeker revision" w:date="2026-10-15T00:00:00Z">
               <w:r>
+                <w:rPr>
+                  <w:color w:val="4A90D9"/>
+                </w:rPr>
                 <w:t xml:space="preserve">0.714 (0.359-0.918)</w:t>
               </w:r>
             </w:ins>
@@ -8495,6 +8619,9 @@
             </w:pPr>
             <w:ins w:id="9203" w:author="HSeeker revision" w:date="2026-10-15T00:00:00Z">
               <w:r>
+                <w:rPr>
+                  <w:color w:val="4A90D9"/>
+                </w:rPr>
                 <w:t xml:space="preserve">0.832 (0.560-1.000)</w:t>
               </w:r>
             </w:ins>
@@ -8517,6 +8644,9 @@
             </w:pPr>
             <w:ins w:id="9206" w:author="HSeeker revision" w:date="2026-10-15T00:00:00Z">
               <w:r>
+                <w:rPr>
+                  <w:color w:val="4A90D9"/>
+                </w:rPr>
                 <w:t xml:space="preserve">Construct-level records</w:t>
               </w:r>
             </w:ins>
@@ -8534,6 +8664,9 @@
             </w:pPr>
             <w:ins w:id="9208" w:author="HSeeker revision" w:date="2026-10-15T00:00:00Z">
               <w:r>
+                <w:rPr>
+                  <w:color w:val="4A90D9"/>
+                </w:rPr>
                 <w:t xml:space="preserve">57</w:t>
               </w:r>
             </w:ins>
@@ -8551,6 +8684,9 @@
             </w:pPr>
             <w:ins w:id="9210" w:author="HSeeker revision" w:date="2026-10-15T00:00:00Z">
               <w:r>
+                <w:rPr>
+                  <w:color w:val="4A90D9"/>
+                </w:rPr>
                 <w:t xml:space="preserve">50</w:t>
               </w:r>
             </w:ins>
@@ -8568,6 +8704,9 @@
             </w:pPr>
             <w:ins w:id="9212" w:author="HSeeker revision" w:date="2026-10-15T00:00:00Z">
               <w:r>
+                <w:rPr>
+                  <w:color w:val="4A90D9"/>
+                </w:rPr>
                 <w:t xml:space="preserve">2</w:t>
               </w:r>
             </w:ins>
@@ -8585,6 +8724,9 @@
             </w:pPr>
             <w:ins w:id="9214" w:author="HSeeker revision" w:date="2026-10-15T00:00:00Z">
               <w:r>
+                <w:rPr>
+                  <w:color w:val="4A90D9"/>
+                </w:rPr>
                 <w:t xml:space="preserve">5</w:t>
               </w:r>
             </w:ins>
@@ -8602,6 +8744,9 @@
             </w:pPr>
             <w:ins w:id="9216" w:author="HSeeker revision" w:date="2026-10-15T00:00:00Z">
               <w:r>
+                <w:rPr>
+                  <w:color w:val="4A90D9"/>
+                </w:rPr>
                 <w:t xml:space="preserve">0</w:t>
               </w:r>
             </w:ins>
@@ -8619,6 +8764,9 @@
             </w:pPr>
             <w:ins w:id="9218" w:author="HSeeker revision" w:date="2026-10-15T00:00:00Z">
               <w:r>
+                <w:rPr>
+                  <w:color w:val="4A90D9"/>
+                </w:rPr>
                 <w:t xml:space="preserve">0.962 (0.870-0.989)</w:t>
               </w:r>
             </w:ins>
@@ -8636,6 +8784,9 @@
             </w:pPr>
             <w:ins w:id="9220" w:author="HSeeker revision" w:date="2026-10-15T00:00:00Z">
               <w:r>
+                <w:rPr>
+                  <w:color w:val="4A90D9"/>
+                </w:rPr>
                 <w:t xml:space="preserve">1.000 (0.566-1.000)</w:t>
               </w:r>
             </w:ins>
@@ -8653,6 +8804,9 @@
             </w:pPr>
             <w:ins w:id="9222" w:author="HSeeker revision" w:date="2026-10-15T00:00:00Z">
               <w:r>
+                <w:rPr>
+                  <w:color w:val="4A90D9"/>
+                </w:rPr>
                 <w:t xml:space="preserve">1.000 (0.929-1.000)</w:t>
               </w:r>
             </w:ins>
@@ -8670,6 +8824,9 @@
             </w:pPr>
             <w:ins w:id="9224" w:author="HSeeker revision" w:date="2026-10-15T00:00:00Z">
               <w:r>
+                <w:rPr>
+                  <w:color w:val="4A90D9"/>
+                </w:rPr>
                 <w:t xml:space="preserve">0.714 (0.359-0.918)</w:t>
               </w:r>
             </w:ins>
@@ -8687,6 +8844,9 @@
             </w:pPr>
             <w:ins w:id="9226" w:author="HSeeker revision" w:date="2026-10-15T00:00:00Z">
               <w:r>
+                <w:rPr>
+                  <w:color w:val="4A90D9"/>
+                </w:rPr>
                 <w:t xml:space="preserve">0.829 (0.556-1.000)</w:t>
               </w:r>
             </w:ins>
@@ -8711,6 +8871,9 @@
       </w:pPr>
       <w:ins w:id="9090" w:author="HSeeker revision" w:date="2026-10-15T00:00:00Z">
         <w:r>
+          <w:rPr>
+            <w:color w:val="4A90D9"/>
+          </w:rPr>
           <w:t xml:space="preserve">Family- and study-aware validation. Because many benchmark records are closely related variants from the same experimental series, we grouped records by sequence family and by study and repeated the evaluation holding out one whole group at a time. The 130 records span 52 sequence families and 27 studies, the largest family, the pXY32 substitution series and its derivatives, accounting for 37 of them. Under leave-one-family-out and leave-one-study-out validation the fixed default configuration reached a coefficient of 0.970, against 0.924 when the parameters were tuned within each training fold. Collapsing the benchmark to one representative per family gave 0.862 over 52 records, and to one representative per family and class 0.945 over 74 records. Because the parameters are fixed, a record's call depends only on its own sequence, and group-aware validation does not shift the point estimate; it widens the confidence interval, and both the record-level and the family-level intervals are reported throughout.</w:t>
         </w:r>
       </w:ins>
@@ -8725,6 +8888,9 @@
       </w:pPr>
       <w:ins w:id="9088" w:author="HSeeker revision" w:date="2026-10-15T00:00:00Z">
         <w:r>
+          <w:rPr>
+            <w:color w:val="4A90D9"/>
+          </w:rPr>
           <w:t xml:space="preserve">Component ablation and parameter robustness. To establish which components of the pipeline account for its behaviour, we evaluated the stages cumulatively, calling a record forming when at least one candidate survives the stage in question. Mirror-repeat detection alone detected 63 of 65 forming records and seven of 65 non-forming records (sensitivity 0.969, specificity 0.892, coefficient 0.864). Adding the purity requirement removed all seven without losing a forming record (specificity 1.000, coefficient 0.970). Adding the AT-content filter, pairing-only scoring, pairing plus stacking, and the complete model with boundary optimisation and homopolymer filtering changed no record-level call. Retaining all candidates, longest-arm selection and score-based selection gave identical record-level calls. Varying one parameter at a time around the defaults: purity 0.80-0.90 gave 0.970, while 0.95 and 1.00 lost nine forming records (0.843); mismatch tolerances of 0 and 0.05 detected 49 of 65 forming records (0.778), 0.10 detected 63 (0.970), and 0.15 and 0.20 detected 64 but added a false positive (0.969); a minimum arm length of 6 added ten false positives (0.839), 7 and 8 gave 0.985 and 0.970, 9 and 10 lost eight forming records (0.884) and 12 lost sixteen (0.778); a maximum spacer of 3 detected 41 forming records (0.679), 5 detected 55 (0.856), and 8 to 15 detected 63 (0.970). Across all 576 combinations with selection confined to training folds, the fixed default configuration performed as well as or better than per-fold tuning under nested cross-validation, leave-one-family-out and leave-one-study-out validation (0.970 against 0.939, 0.924 and 0.924), and tuning did not beat the fixed configuration in any of 200 random splits. A minimum arm length of 8 was selected in 99% of nested folds and in every family and study fold, and a mismatch tolerance of 0.10 in 48 of 52 family folds. Performance therefore does depend on these choices, but the reported results do not rest on a single hand-selected parameterisation. The scorer does not expose an independent mismatch-penalty switch, so we do not claim to have ablated that penalty separately.</w:t>
         </w:r>
       </w:ins>
@@ -8739,6 +8905,9 @@
       </w:pPr>
       <w:ins w:id="9086" w:author="HSeeker revision" w:date="2026-10-15T00:00:00Z">
         <w:r>
+          <w:rPr>
+            <w:color w:val="4A90D9"/>
+          </w:rPr>
           <w:t xml:space="preserve">Comparison with existing tools. On the balanced benchmark HSeeker reached a coefficient of 0.970 (family-level 95% CI 0.909-1.000), followed by triplex at 0.819 (0.744-0.936), NeSSie at 0.583 (0.421-0.780), nBMST at 0.449 (0.346-0.560) and Triplexator at 0.024 (-0.137-0.249) (Table 1, Supplementary Figure 1). Using paired differences with confidence intervals, the difference was +0.15 (0.03-0.22) against triplex, with 10 records called correctly by HSeeker and none by triplex alone (exact McNemar p = 0.002), +0.39 (0.18-0.55) against NeSSie, +0.52 (0.41-0.62) against nBMST and +0.95 (0.71-1.11) against Triplexator. The advantage over triplex comes from the designed negatives: on the 70 experimental records alone the difference was +0.06 with an interval reaching zero (0.00-0.23), and on that set the two tools are comparable. These differences follow from what each tool searches for. Triplexator enumerates duplex target sites for a separately supplied third strand and does not require a mirror repeat; at the settings used in our original manuscript it detects 64 of 65 forming records but also calls 42 of the 65 negatives, including all 22 mirror-disrupted mutants. NeSSie reports k-mers that are themselves mirror-symmetric rather than arm-spacer-arm motifs; it made no false call but detected none of the 16 pXY32 constructs. nBMST's mirror-repeat module matches HSeeker's geometry, but its triplex classification accepts only mirror repeats with more purines than pyrimidines on the reported strand, so it detected none of the 19 forming records written on the pyrimidine-rich strand, whereas its unclassified mirror-repeat output detected 15 of them. triplex, the only other tool designed for intramolecular triplexes, detected nearly the same forming records as HSeeker but called nine designed negatives forming, seven of them mirror-disrupted mutants. In the homopolymer panel, triplex and NeSSie call four of the five A/T homopolymers forming, and both call poly-(dC)30 forming; Triplexator calls none; nBMST calls poly-A30 only; and HSeeker calls none, which is correct for the five A/T homopolymers and incorrect for poly-(dC)30 (Supplementary Table 5).</w:t>
         </w:r>
       </w:ins>
@@ -8753,6 +8922,9 @@
       </w:pPr>
       <w:ins w:id="9084" w:author="HSeeker revision" w:date="2026-10-15T00:00:00Z">
         <w:r>
+          <w:rPr>
+            <w:color w:val="4A90D9"/>
+          </w:rPr>
           <w:t xml:space="preserve">Genomic context recovery. Sequences are rarely scanned in isolation, so we asked whether embedding a sequence in a genome changes the call made on it. Inserting the 130 benchmark sequences into the E. coli K-12 genome left HSeeker's calls unchanged for every record: the same 63 forming sequences were detected, no non-forming sequence was called, and the resulting coefficient of 0.970 is identical to the value obtained on the sequences alone (Figure 3A, B). The matching hit covered the whole inserted sequence for the majority of records and at least half of it in every case (Figure 3D). triplex, run on the same modified genome, returned a different call for 44 of the 130 records, in each case a detection present when the sequence was scanned alone and absent once it was embedded, and its coefficient fell from 0.819 to 0.512. Varying the overlap required to match a hit to an insertion from 0.50 to 0.95 changed neither result (Figure 3C). The unmodified genome yielded 83 loci across its 4.64 Mb, or 17.9 per Mb, and the hits in the modified genome are accounted for by those background loci together with the recovered insertions. This experiment measures the stability of a call across sequence context, not whether H-DNA forms. We draw no biological conclusion from it; the comparison with measured single-stranded DNA follows.</w:t>
         </w:r>
       </w:ins>
@@ -8767,6 +8939,9 @@
       </w:pPr>
       <w:ins w:id="9082" w:author="HSeeker revision" w:date="2026-10-15T00:00:00Z">
         <w:r>
+          <w:rPr>
+            <w:color w:val="4A90D9"/>
+          </w:rPr>
           <w:t xml:space="preserve">Comparison with single-stranded DNA maps. We compared HSeeker's predictions with the permanganate/S1 footprinting data of Kouzine and colleagues. HSeeker loci overlap 79.0% of the H-DNA structures found to be formed in mouse (13,517 of 17,109) and 82.3% in human Raji cells (6,879 of 8,356). Among their predicted H-DNA motifs, those HSeeker calls are formed more often than those it does not: 4.5% against 2.8% in mouse (odds ratio 1.65, 95% CI 1.59-1.71) and 5.7% against 1.7% in human (3.39, 3.20-3.59); restricting to motifs that the 36-nt reads can map to raises these to 1.68-2.07 and 4.16-5.70 (Figure 4A, B). Across all HSeeker loci with genome-wide composition-matched controls, loci in activated mouse B cells carried 14% more single-stranded signal than their controls (ratio of means 1.137, 1.127-1.147; 825,749 loci); in resting B cells the ratio was 0.822 (0.818-0.827) and in human Raji cells 0.977 (0.969-0.984). Restricting loci and controls to mappable sequence more than 100 bp from other predicted non-B motifs and more than 2 kb from annotated transcription start sites, activated mouse B cells carried 25% more signal than their controls (1.254, 1.179-1.332; a locus exceeded one of its own controls with probability 0.514, p = 2 x 10-17), while human Raji cells showed no detectable excess (1.023, 0.988-1.061; p = 0.08). Two built-in checks behaved as required: comparing one control against the remaining controls of the same locus gave no difference (0.500-0.502), and the motifs the authors called formed were enriched 7.4-fold in mouse and 2.1-fold in human under the identical procedure (Figure 4C). The excess increased with mirror-repeat arm length, from no detectable effect at 8-9 nt (1.12, 0.93-1.35) to 1.58 (1.34-1.83) at 12-14 nt and 1.6-1.8 at longer arms (Spearman p = 3 x 10-21), and was absent in resting B cells (0.858, 0.831-0.885), consistent with the activation- and supercoiling-dependent formation the authors report (Figure 4D). Most formed H-DNA that HSeeker does not report are short A/T-rich or single-base motifs excluded by the composition filters; in these data that class is formed at about half the rate of other predicted H-DNA in mouse and a quarter in human, which supports excluding it by default, though it is 17-19% of the formed H-DNA. These results associate HSeeker loci in activated mouse B cells with single-stranded DNA beyond what composition, mappability, local context, the other predicted non-B structures and promoter transcription account for, and the association strengthens with arm length, as H-DNA formation should. We did not observe the same enrichment in human Raji cells. The per-locus effect is modest even in mouse: in a given cell state most HSeeker loci, like most control windows, carry no single-stranded signal, so the loci are candidates rather than sites demonstrated to be structured.</w:t>
         </w:r>
       </w:ins>
@@ -8986,6 +9161,7 @@
       <w:ins w:id="9118" w:author="HSeeker revision" w:date="2026-10-15T00:00:00Z">
         <w:r>
           <w:rPr>
+            <w:color w:val="4A90D9"/>
             <w:b w:val="1"/>
             <w:bCs w:val="1"/>
             <w:rtl w:val="0"/>
@@ -9009,6 +9185,9 @@
       </w:pPr>
       <w:ins w:id="9122" w:author="HSeeker revision" w:date="2026-10-15T00:00:00Z">
         <w:r>
+          <w:rPr>
+            <w:color w:val="4A90D9"/>
+          </w:rPr>
           <w:drawing>
             <wp:inline distB="114300" distT="114300" distL="114300" distR="114300">
               <wp:extent cx="5943600" cy="4674203"/>
@@ -9053,6 +9232,9 @@
       </w:pPr>
       <w:ins w:id="9120" w:author="HSeeker revision" w:date="2026-10-15T00:00:00Z">
         <w:r>
+          <w:rPr>
+            <w:color w:val="4A90D9"/>
+          </w:rPr>
           <w:t xml:space="preserve">Figure 4: HSeeker predictions compared with single-stranded DNA mapped in cells. HSeeker was run at its default settings on the genome assemblies used by Kouzine and colleagues. A) Recall: the percentage of the H-DNA motifs they found single-stranded that are overlapped by an HSeeker locus, in activated mouse B cells and in human Raji cells. B) Selectivity: the odds ratio that one of their predicted H-DNA motifs is found single-stranded when HSeeker reports it against when it does not, for all analysed motifs and for motifs that 36-nt reads can map to. C) Single-stranded signal at HSeeker loci relative to control windows matched for length, A/T content and purine/pyrimidine asymmetry. All loci uses genome-wide controls; isolated loci restricts loci and controls to mappable sequence more than 100 bp from other predicted non-B motifs and more than 2 kb from annotated transcription start sites, with controls drawn within 50 kb; authors' formed motifs applies the identical procedure to the motifs they called formed; placebo compares one control against the remaining controls of the same locus. D) Isolated loci stratified by mirror-repeat arm length. Points are ratios of mean signal, bars are 95% bootstrap confidence intervals, and the dashed line marks no difference. Scales in B-D are logarithmic.</w:t>
         </w:r>
       </w:ins>
@@ -9116,6 +9298,7 @@
       <w:ins w:id="9235" w:author="HSeeker revision" w:date="2026-10-15T00:00:00Z">
         <w:r>
           <w:rPr>
+            <w:color w:val="4A90D9"/>
             <w:rtl w:val="0"/>
           </w:rPr>
           <w:t xml:space="preserve">export putative H-DNA-forming loci</w:t>
@@ -9186,6 +9369,7 @@
       <w:ins w:id="9092" w:author="HSeeker revision" w:date="2026-10-15T00:00:00Z">
         <w:r>
           <w:rPr>
+            <w:color w:val="4A90D9"/>
             <w:rtl w:val="0"/>
           </w:rPr>
           <w:t xml:space="preserve">we developed a single web interface that enables users to identify putative H-DNA-forming sequences without requiring command-line experience. It uses the same scanning library and the same default settings as the command-line tool, so that the two return identical results for identical input.</w:t>
@@ -9208,6 +9392,7 @@
       <w:ins w:id="9237" w:author="HSeeker revision" w:date="2026-10-15T00:00:00Z">
         <w:r>
           <w:rPr>
+            <w:color w:val="4A90D9"/>
             <w:rtl w:val="0"/>
           </w:rPr>
           <w:t xml:space="preserve">retrieve annotated putative H-DNA motifs</w:t>
@@ -9277,6 +9462,7 @@
       <w:ins w:id="9124" w:author="HSeeker revision" w:date="2026-10-15T00:00:00Z">
         <w:r>
           <w:rPr>
+            <w:color w:val="4A90D9"/>
             <w:rtl w:val="0"/>
           </w:rPr>
           <w:t xml:space="preserve">(Figure 5)</w:t>
@@ -9324,6 +9510,7 @@
       <w:ins w:id="9239" w:author="HSeeker revision" w:date="2026-10-15T00:00:00Z">
         <w:r>
           <w:rPr>
+            <w:color w:val="4A90D9"/>
             <w:rtl w:val="0"/>
           </w:rPr>
           <w:t xml:space="preserve">the putative H-DNA motifs</w:t>
@@ -9360,6 +9547,7 @@
       <w:ins w:id="9126" w:author="HSeeker revision" w:date="2026-10-15T00:00:00Z">
         <w:r>
           <w:rPr>
+            <w:color w:val="4A90D9"/>
             <w:rtl w:val="0"/>
           </w:rPr>
           <w:t xml:space="preserve">(Figure 5)</w:t>
@@ -9570,6 +9758,7 @@
       <w:ins w:id="9128" w:author="HSeeker revision" w:date="2026-10-15T00:00:00Z">
         <w:r>
           <w:rPr>
+            <w:color w:val="4A90D9"/>
             <w:b w:val="1"/>
             <w:bCs w:val="1"/>
             <w:rtl w:val="0"/>
@@ -9688,6 +9877,7 @@
       <w:ins w:id="9130" w:author="HSeeker revision" w:date="2026-10-15T00:00:00Z">
         <w:r>
           <w:rPr>
+            <w:color w:val="4A90D9"/>
             <w:b w:val="1"/>
             <w:bCs w:val="1"/>
             <w:rtl w:val="0"/>
@@ -9850,6 +10040,7 @@
       <w:ins w:id="9094" w:author="HSeeker revision" w:date="2026-10-15T00:00:00Z">
         <w:r>
           <w:rPr>
+            <w:color w:val="4A90D9"/>
             <w:rtl w:val="0"/>
           </w:rPr>
           <w:t xml:space="preserve">We also performed thorough benchmarking against four existing H-DNA and mirror-repeat detection tools, triplex, Triplexator, NeSSie and nBMST</w:t>
@@ -9975,6 +10166,7 @@
       <w:ins w:id="9096" w:author="HSeeker revision" w:date="2026-10-15T00:00:00Z">
         <w:r>
           <w:rPr>
+            <w:color w:val="4A90D9"/>
             <w:rtl w:val="0"/>
           </w:rPr>
           <w:t xml:space="preserve">The stability score ranks candidates in a manner consistent with the biochemical and genetic evidence available for the sequences in our benchmark; it is an experimentally informed heuristic and has not been calibrated against measured thermodynamic quantities.</w:t>
@@ -10057,6 +10249,7 @@
       <w:ins w:id="9098" w:author="HSeeker revision" w:date="2026-10-15T00:00:00Z">
         <w:r>
           <w:rPr>
+            <w:color w:val="4A90D9"/>
             <w:rtl w:val="0"/>
           </w:rPr>
           <w:t xml:space="preserve">Among currently available tools for intramolecular H-DNA, HSeeker is the only one that reports a per-motif stability ranking alongside the detected coordinates, and it achieves high-throughput processing speeds.</w:t>
@@ -10091,6 +10284,7 @@
       <w:ins w:id="9100" w:author="HSeeker revision" w:date="2026-10-15T00:00:00Z">
         <w:r>
           <w:rPr>
+            <w:color w:val="4A90D9"/>
             <w:rtl w:val="0"/>
           </w:rPr>
           <w:t xml:space="preserve">it was able to screen the entire human chromosome 1 in approximately 16 seconds, and the complete human genome in 3.4 minutes, using a standard multi-threaded environment.</w:t>
@@ -10137,6 +10331,7 @@
       <w:ins w:id="9102" w:author="HSeeker revision" w:date="2026-10-15T00:00:00Z">
         <w:r>
           <w:rPr>
+            <w:color w:val="4A90D9"/>
             <w:vertAlign w:val="superscript"/>
             <w:rtl w:val="0"/>
           </w:rPr>
@@ -10301,6 +10496,7 @@
       <w:ins w:id="9104" w:author="HSeeker revision" w:date="2026-10-15T00:00:00Z">
         <w:r>
           <w:rPr>
+            <w:color w:val="4A90D9"/>
             <w:b w:val="1"/>
             <w:bCs w:val="1"/>
             <w:sz w:val="24"/>
@@ -10658,6 +10854,7 @@
       <w:ins w:id="9134" w:author="HSeeker revision" w:date="2026-10-15T00:00:00Z">
         <w:r>
           <w:rPr>
+            <w:color w:val="4A90D9"/>
             <w:b w:val="1"/>
             <w:bCs w:val="1"/>
             <w:rtl w:val="0"/>
@@ -12589,6 +12786,7 @@
       <w:ins w:id="9132" w:author="HSeeker revision" w:date="2026-10-15T00:00:00Z">
         <w:r>
           <w:rPr>
+            <w:color w:val="4A90D9"/>
             <w:rtl w:val="0"/>
           </w:rPr>
           <w:t xml:space="preserve">28.Kohwi, Y. &amp; Kohwi-Shigematsu, T. Magnesium ion-dependent triple-helix structure formed by homopurine-homopyrimidine sequences in supercoiled plasmid DNA. Proc Natl Acad Sci U S A 85, 3781-3785 (1988).</w:t>

</xml_diff>